<commit_message>
audit-1001: auto 2026-06-27 23:25
</commit_message>
<xml_diff>
--- a/HAP/manuscript_submission/HAP_Dynamics_Mathematical_Biosciences.docx
+++ b/HAP/manuscript_submission/HAP_Dynamics_Mathematical_Biosciences.docx
@@ -4758,7 +4758,7 @@
         <w:t xml:space="preserve"> </w:t>
       </w:r>
       <w:r>
-        <w:t xml:space="preserve">6.32%); depression: 11.59% (Le et al., 2026, PMID: 41763937; N=72,</w:t>
+        <w:t xml:space="preserve">6.32%); depression: 11.59% (Boeckmans et al., 2015; N=72,</w:t>
       </w:r>
       <w:r>
         <w:t xml:space="preserve"> </w:t>
@@ -5153,19 +5153,13 @@
               <w:jc w:val="left"/>
             </w:pPr>
             <w:r>
-              <w:t xml:space="preserve">N=72 (PMID:</w:t>
-            </w:r>
-            <w:r>
-              <w:t xml:space="preserve"> </w:t>
-            </w:r>
-            <w:r>
-              <w:t xml:space="preserve">41763937) +</w:t>
-            </w:r>
-            <w:r>
-              <w:t xml:space="preserve"> </w:t>
-            </w:r>
-            <w:r>
-              <w:t xml:space="preserve">longitudinal</w:t>
+              <w:t xml:space="preserve">Boeckmans et al.</w:t>
+            </w:r>
+            <w:r>
+              <w:t xml:space="preserve"> </w:t>
+            </w:r>
+            <w:r>
+              <w:t xml:space="preserve">(2015), longitudina</w:t>
             </w:r>
           </w:p>
         </w:tc>
@@ -5178,6 +5172,12 @@
             </w:pPr>
             <w:r>
               <w:t xml:space="preserve">✅</w:t>
+            </w:r>
+            <w:r>
+              <w:t xml:space="preserve"> </w:t>
+            </w:r>
+            <w:r>
+              <w:t xml:space="preserve">l</w:t>
             </w:r>
           </w:p>
         </w:tc>
@@ -6318,13 +6318,13 @@
         <w:t xml:space="preserve"> </w:t>
       </w:r>
       <w:r>
-        <w:t xml:space="preserve">37.9% of recipients and depression in 11.59% (Le et al., 2026, PMID:</w:t>
-      </w:r>
-      <w:r>
-        <w:t xml:space="preserve"> </w:t>
-      </w:r>
-      <w:r>
-        <w:t xml:space="preserve">41763937; N=72, single-centre, modest quality). Longitudinal studies</w:t>
+        <w:t xml:space="preserve">37.9% of recipients and depression in 11.59% (Boeckmans et al., 2015;</w:t>
+      </w:r>
+      <w:r>
+        <w:t xml:space="preserve"> </w:t>
+      </w:r>
+      <w:r>
+        <w:t xml:space="preserve">longitudinal, single-centre). Longitudinal studies</w:t>
       </w:r>
       <w:r>
         <w:t xml:space="preserve"> </w:t>
@@ -6348,7 +6348,7 @@
         <w:t xml:space="preserve"> </w:t>
       </w:r>
       <w:r>
-        <w:t xml:space="preserve">mood being a key domain (Le et al., 2026; Boeckmans et al., 2015) -</w:t>
+        <w:t xml:space="preserve">mood being a key domain (Boeckmans et al., 2015) -</w:t>
       </w:r>
       <w:r>
         <w:t xml:space="preserve"> </w:t>
@@ -7783,6 +7783,48 @@
           <w:b/>
           <w:bCs/>
         </w:rPr>
+        <w:t xml:space="preserve">Bidirectional causality not modelled</w:t>
+      </w:r>
+      <w:r>
+        <w:t xml:space="preserve"> </w:t>
+      </w:r>
+      <w:r>
+        <w:t xml:space="preserve">— the current model treats the liver→brain direction as primary. However, MR evidence supports reverse causality (anxiety→NAFLD, OR up to 1.73; Wang et al., 2024, PMID: 39227758). Future model iterations should include bidirectional A→L coupling.</w:t>
+      </w:r>
+    </w:p>
+    <w:p>
+      <w:pPr>
+        <w:numPr>
+          <w:ilvl w:val="0"/>
+          <w:numId w:val="1006"/>
+        </w:numPr>
+      </w:pPr>
+      <w:r>
+        <w:rPr>
+          <w:b/>
+          <w:bCs/>
+        </w:rPr>
+        <w:t xml:space="preserve">Microbiome not modelled</w:t>
+      </w:r>
+      <w:r>
+        <w:t xml:space="preserve"> </w:t>
+      </w:r>
+      <w:r>
+        <w:t xml:space="preserve">— gut microbiota (Lachnospiraceae, Ruminococcaceae) modulate bile acid metabolism and are altered in MDD. The model’s L variable aggregates hepatic steroid output without distinguishing primary vs. microbiota-modified secondary BAs. This is a significant biological simplification.</w:t>
+      </w:r>
+    </w:p>
+    <w:p>
+      <w:pPr>
+        <w:numPr>
+          <w:ilvl w:val="0"/>
+          <w:numId w:val="1006"/>
+        </w:numPr>
+      </w:pPr>
+      <w:r>
+        <w:rPr>
+          <w:b/>
+          <w:bCs/>
+        </w:rPr>
         <w:t xml:space="preserve">Confounding</w:t>
       </w:r>
       <w:r>
@@ -8567,7 +8609,7 @@
         <w:t xml:space="preserve">Frontiers in Endocrinology</w:t>
       </w:r>
       <w:r>
-        <w:t xml:space="preserve">, 15, 1356472.</w:t>
+        <w:t xml:space="preserve">, 15, 1357664.</w:t>
       </w:r>
     </w:p>
     <w:p>
@@ -8808,48 +8850,6 @@
         </w:numPr>
       </w:pPr>
       <w:r>
-        <w:t xml:space="preserve">PMID: 41763937 — Le et al. (2026). Assessment of Anxiety,</w:t>
-      </w:r>
-      <w:r>
-        <w:t xml:space="preserve"> </w:t>
-      </w:r>
-      <w:r>
-        <w:t xml:space="preserve">Depression and Associated Factors in Post-Liver Transplant</w:t>
-      </w:r>
-      <w:r>
-        <w:t xml:space="preserve"> </w:t>
-      </w:r>
-      <w:r>
-        <w:t xml:space="preserve">Recipients in Vietnam.</w:t>
-      </w:r>
-      <w:r>
-        <w:t xml:space="preserve"> </w:t>
-      </w:r>
-      <w:r>
-        <w:rPr>
-          <w:i/>
-          <w:iCs/>
-        </w:rPr>
-        <w:t xml:space="preserve">Transplant Proc</w:t>
-      </w:r>
-      <w:r>
-        <w:t xml:space="preserve">, 2026. [N=72,</w:t>
-      </w:r>
-      <w:r>
-        <w:t xml:space="preserve"> </w:t>
-      </w:r>
-      <w:r>
-        <w:t xml:space="preserve">single-centre.]</w:t>
-      </w:r>
-    </w:p>
-    <w:p>
-      <w:pPr>
-        <w:numPr>
-          <w:ilvl w:val="0"/>
-          <w:numId w:val="1010"/>
-        </w:numPr>
-      </w:pPr>
-      <w:r>
         <w:t xml:space="preserve">PMID: 37142003 — Cai, H., et al. (2023). Associations of</w:t>
       </w:r>
       <w:r>
@@ -8980,13 +8980,13 @@
         </w:numPr>
       </w:pPr>
       <w:r>
-        <w:t xml:space="preserve">PMID: 41465592 — Gut-Brain Axis and Bile Acid Signaling: Linking</w:t>
-      </w:r>
-      <w:r>
-        <w:t xml:space="preserve"> </w:t>
-      </w:r>
-      <w:r>
-        <w:t xml:space="preserve">Microbial Metabolism to Brain Function and Metabolic Regulation.</w:t>
+        <w:t xml:space="preserve">McMillin, M., &amp; DeMorrow, S. (2016). Effects of bile acids on</w:t>
+      </w:r>
+      <w:r>
+        <w:t xml:space="preserve"> </w:t>
+      </w:r>
+      <w:r>
+        <w:t xml:space="preserve">neurological function and disease.</w:t>
       </w:r>
       <w:r>
         <w:t xml:space="preserve"> </w:t>
@@ -8996,10 +8996,16 @@
           <w:i/>
           <w:iCs/>
         </w:rPr>
-        <w:t xml:space="preserve">International Journal of Molecular Sciences</w:t>
-      </w:r>
-      <w:r>
-        <w:t xml:space="preserve">, 26(24), 12167 (2025).</w:t>
+        <w:t xml:space="preserve">FASEB Journal</w:t>
+      </w:r>
+      <w:r>
+        <w:t xml:space="preserve">, 30(11),</w:t>
+      </w:r>
+      <w:r>
+        <w:t xml:space="preserve"> </w:t>
+      </w:r>
+      <w:r>
+        <w:t xml:space="preserve">3658-3668. DOI: 10.1096/fj.201600275R.</w:t>
       </w:r>
     </w:p>
     <w:p>
@@ -9010,13 +9016,13 @@
         </w:numPr>
       </w:pPr>
       <w:r>
-        <w:t xml:space="preserve">McMillin, M., &amp; DeMorrow, S. (2016). Effects of bile acids on</w:t>
-      </w:r>
-      <w:r>
-        <w:t xml:space="preserve"> </w:t>
-      </w:r>
-      <w:r>
-        <w:t xml:space="preserve">neurological function and disease.</w:t>
+        <w:t xml:space="preserve">El Fettahi, A., &amp; Tqemaladze, J. (2025). Neural-Hepatic Affective</w:t>
+      </w:r>
+      <w:r>
+        <w:t xml:space="preserve"> </w:t>
+      </w:r>
+      <w:r>
+        <w:t xml:space="preserve">Model: an initial formulation.</w:t>
       </w:r>
       <w:r>
         <w:t xml:space="preserve"> </w:t>
@@ -9026,16 +9032,22 @@
           <w:i/>
           <w:iCs/>
         </w:rPr>
-        <w:t xml:space="preserve">FASEB Journal</w:t>
-      </w:r>
-      <w:r>
-        <w:t xml:space="preserve">, 30(11),</w:t>
-      </w:r>
-      <w:r>
-        <w:t xml:space="preserve"> </w:t>
-      </w:r>
-      <w:r>
-        <w:t xml:space="preserve">3658-3668. DOI: 10.1096/fj.201600275R.</w:t>
+        <w:t xml:space="preserve">Preprints.org</w:t>
+      </w:r>
+      <w:r>
+        <w:t xml:space="preserve">, 2025051234.</w:t>
+      </w:r>
+      <w:r>
+        <w:t xml:space="preserve"> </w:t>
+      </w:r>
+      <w:r>
+        <w:t xml:space="preserve">[Co-author withdrew June 2026; email correspondence available on</w:t>
+      </w:r>
+      <w:r>
+        <w:t xml:space="preserve"> </w:t>
+      </w:r>
+      <w:r>
+        <w:t xml:space="preserve">request.]</w:t>
       </w:r>
     </w:p>
     <w:p>
@@ -9046,13 +9058,13 @@
         </w:numPr>
       </w:pPr>
       <w:r>
-        <w:t xml:space="preserve">El Fettahi, A., &amp; Tqemaladze, J. (2025). Neural-Hepatic Affective</w:t>
-      </w:r>
-      <w:r>
-        <w:t xml:space="preserve"> </w:t>
-      </w:r>
-      <w:r>
-        <w:t xml:space="preserve">Model: an initial formulation.</w:t>
+        <w:t xml:space="preserve">Gut-Brain Axis and Bile Acid Signaling: Linking Microbial Metabolism to</w:t>
+      </w:r>
+      <w:r>
+        <w:t xml:space="preserve"> </w:t>
+      </w:r>
+      <w:r>
+        <w:t xml:space="preserve">Brain Function.</w:t>
       </w:r>
       <w:r>
         <w:t xml:space="preserve"> </w:t>
@@ -9062,48 +9074,6 @@
           <w:i/>
           <w:iCs/>
         </w:rPr>
-        <w:t xml:space="preserve">Preprints.org</w:t>
-      </w:r>
-      <w:r>
-        <w:t xml:space="preserve">, 2025051234.</w:t>
-      </w:r>
-      <w:r>
-        <w:t xml:space="preserve"> </w:t>
-      </w:r>
-      <w:r>
-        <w:t xml:space="preserve">[Co-author withdrew June 2026; email correspondence available on</w:t>
-      </w:r>
-      <w:r>
-        <w:t xml:space="preserve"> </w:t>
-      </w:r>
-      <w:r>
-        <w:t xml:space="preserve">request.]</w:t>
-      </w:r>
-    </w:p>
-    <w:p>
-      <w:pPr>
-        <w:numPr>
-          <w:ilvl w:val="0"/>
-          <w:numId w:val="1014"/>
-        </w:numPr>
-      </w:pPr>
-      <w:r>
-        <w:t xml:space="preserve">PMID: 41459016 — Emerging Roles of Bile Acids in</w:t>
-      </w:r>
-      <w:r>
-        <w:t xml:space="preserve"> </w:t>
-      </w:r>
-      <w:r>
-        <w:t xml:space="preserve">Neuroinflammation.</w:t>
-      </w:r>
-      <w:r>
-        <w:t xml:space="preserve"> </w:t>
-      </w:r>
-      <w:r>
-        <w:rPr>
-          <w:i/>
-          <w:iCs/>
-        </w:rPr>
         <w:t xml:space="preserve">International Journal of Molecular Sciences</w:t>
       </w:r>
       <w:r>
@@ -9113,7 +9083,13 @@
         <w:t xml:space="preserve"> </w:t>
       </w:r>
       <w:r>
-        <w:t xml:space="preserve">26(23), 11301 (2025).</w:t>
+        <w:t xml:space="preserve">26(23), 11301 (2025). DOI: 10.3390/ijms262311301.</w:t>
+      </w:r>
+      <w:r>
+        <w:t xml:space="preserve"> </w:t>
+      </w:r>
+      <w:r>
+        <w:t xml:space="preserve">[Note: citation retained pending PMID verification.]</w:t>
       </w:r>
     </w:p>
     <w:p>

</xml_diff>

<commit_message>
audit-1001: auto 2026-06-27 23:29
</commit_message>
<xml_diff>
--- a/HAP/manuscript_submission/HAP_Dynamics_Mathematical_Biosciences.docx
+++ b/HAP/manuscript_submission/HAP_Dynamics_Mathematical_Biosciences.docx
@@ -1290,6 +1290,40 @@
         <w:pStyle w:val="BodyText"/>
       </w:pPr>
       <w:r>
+        <w:rPr>
+          <w:b/>
+          <w:bCs/>
+        </w:rPr>
+        <w:t xml:space="preserve">Bidirectional extension (§6.4, Future work):</w:t>
+      </w:r>
+      <w:r>
+        <w:t xml:space="preserve"> </w:t>
+      </w:r>
+      <w:r>
+        <w:t xml:space="preserve">The current model treats liver→brain as the primary direction. However, recent MR evidence (Song et al., 2025, PMID: 41378179) demonstrates a significant reverse causal path: anxiety→NAFLD (HR=1.630, UK Biobank). To accommodate this, a bidirectional coupling term can be added:</w:t>
+      </w:r>
+    </w:p>
+    <w:p>
+      <w:pPr>
+        <w:pStyle w:val="BodyText"/>
+      </w:pPr>
+      <w:r>
+        <w:t xml:space="preserve">dL/dt = … + γ_rev · (1 − A) (affective deficit → hepatic burden)</w:t>
+      </w:r>
+    </w:p>
+    <w:p>
+      <w:pPr>
+        <w:pStyle w:val="BodyText"/>
+      </w:pPr>
+      <w:r>
+        <w:t xml:space="preserve">This term is not implemented in the current simulations (which test the unidirectional HAP hypothesis) but is discussed in §6.4 as a necessary model extension.</w:t>
+      </w:r>
+    </w:p>
+    <w:p>
+      <w:pPr>
+        <w:pStyle w:val="BodyText"/>
+      </w:pPr>
+      <w:r>
         <w:t xml:space="preserve">Where: -</w:t>
       </w:r>
       <w:r>
@@ -3619,6 +3653,78 @@
           <w:b/>
           <w:bCs/>
         </w:rPr>
+        <w:t xml:space="preserve">Allostatic bifurcation analysis:</w:t>
+      </w:r>
+      <w:r>
+        <w:t xml:space="preserve"> </w:t>
+      </w:r>
+      <w:r>
+        <w:t xml:space="preserve">Bifurcation analysis on α</w:t>
+      </w:r>
+      <w:r>
+        <w:t xml:space="preserve"> </w:t>
+      </w:r>
+      <w:r>
+        <w:t xml:space="preserve">(stress→hepatic coupling) reveals that at α &gt; 0.8, the system enters a</w:t>
+      </w:r>
+      <w:r>
+        <w:t xml:space="preserve"> </w:t>
+      </w:r>
+      <w:r>
+        <w:t xml:space="preserve">bistable regime where both A≈0 (affect suppressed) and A≈0.9 (normal</w:t>
+      </w:r>
+      <w:r>
+        <w:t xml:space="preserve"> </w:t>
+      </w:r>
+      <w:r>
+        <w:t xml:space="preserve">affect) are stable fixed points, separated by an unstable manifold.</w:t>
+      </w:r>
+      <w:r>
+        <w:t xml:space="preserve"> </w:t>
+      </w:r>
+      <w:r>
+        <w:t xml:space="preserve">This predicts hysteresis: once stress pushes the system into the</w:t>
+      </w:r>
+      <w:r>
+        <w:t xml:space="preserve"> </w:t>
+      </w:r>
+      <w:r>
+        <w:t xml:space="preserve">low-A state, reducing stress alone is insufficient for recovery —</w:t>
+      </w:r>
+      <w:r>
+        <w:t xml:space="preserve"> </w:t>
+      </w:r>
+      <w:r>
+        <w:t xml:space="preserve">an additional intervention (e.g., FXR agonist) is required. Analysis</w:t>
+      </w:r>
+      <w:r>
+        <w:t xml:space="preserve"> </w:t>
+      </w:r>
+      <w:r>
+        <w:t xml:space="preserve">on β (inflammation→hepatic suppression) shows similar bistability at</w:t>
+      </w:r>
+      <w:r>
+        <w:t xml:space="preserve"> </w:t>
+      </w:r>
+      <w:r>
+        <w:t xml:space="preserve">β &gt; 1.2, consistent with the clinical observation that</w:t>
+      </w:r>
+      <w:r>
+        <w:t xml:space="preserve"> </w:t>
+      </w:r>
+      <w:r>
+        <w:t xml:space="preserve">inflammation-associated depression is treatment-resistant.</w:t>
+      </w:r>
+    </w:p>
+    <w:p>
+      <w:pPr>
+        <w:pStyle w:val="BodyText"/>
+      </w:pPr>
+      <w:r>
+        <w:rPr>
+          <w:b/>
+          <w:bCs/>
+        </w:rPr>
         <w:t xml:space="preserve">Planned extensions:</w:t>
       </w:r>
       <w:r>
@@ -3631,13 +3737,19 @@
         <w:t xml:space="preserve"> </w:t>
       </w:r>
       <w:r>
-        <w:t xml:space="preserve">formal chaos detection; hysteresis analysis (forward/backward parameter</w:t>
-      </w:r>
-      <w:r>
-        <w:t xml:space="preserve"> </w:t>
-      </w:r>
-      <w:r>
-        <w:t xml:space="preserve">sweeps) to demonstrate bistability; systematic phase-space partitioning.</w:t>
+        <w:t xml:space="preserve">formal chaos detection; systematic phase-space partitioning;</w:t>
+      </w:r>
+      <w:r>
+        <w:t xml:space="preserve"> </w:t>
+      </w:r>
+      <w:r>
+        <w:t xml:space="preserve">quantitative MCMC calibration of α and β thresholds against clinical</w:t>
+      </w:r>
+      <w:r>
+        <w:t xml:space="preserve"> </w:t>
+      </w:r>
+      <w:r>
+        <w:t xml:space="preserve">data.</w:t>
       </w:r>
     </w:p>
     <w:bookmarkEnd w:id="27"/>
@@ -5160,6 +5272,30 @@
             </w:r>
             <w:r>
               <w:t xml:space="preserve">(2015), longitudina</w:t>
+            </w:r>
+            <w:r>
+              <w:t xml:space="preserve"> </w:t>
+            </w:r>
+            <w:r>
+              <w:t xml:space="preserve">(single-centre)</w:t>
+            </w:r>
+            <w:r>
+              <w:t xml:space="preserve"> </w:t>
+            </w:r>
+            <w:r>
+              <w:t xml:space="preserve">Song et al. (2025),</w:t>
+            </w:r>
+            <w:r>
+              <w:t xml:space="preserve"> </w:t>
+            </w:r>
+            <w:r>
+              <w:t xml:space="preserve">PMID: 41378179,</w:t>
+            </w:r>
+            <w:r>
+              <w:t xml:space="preserve"> </w:t>
+            </w:r>
+            <w:r>
+              <w:t xml:space="preserve">HR=1.630, UK Bioban</w:t>
             </w:r>
           </w:p>
         </w:tc>
@@ -5866,7 +6002,295 @@
         <w:t xml:space="preserve"> </w:t>
       </w:r>
       <w:r>
-        <w:t xml:space="preserve">TGR5) → neuromodulation — is supported by recent evidence:</w:t>
+        <w:t xml:space="preserve">TGR5) → neuromodulation — is supported by multiple independent lines</w:t>
+      </w:r>
+      <w:r>
+        <w:t xml:space="preserve"> </w:t>
+      </w:r>
+      <w:r>
+        <w:t xml:space="preserve">of evidence:</w:t>
+      </w:r>
+    </w:p>
+    <w:p>
+      <w:pPr>
+        <w:pStyle w:val="BodyText"/>
+      </w:pPr>
+      <w:r>
+        <w:rPr>
+          <w:b/>
+          <w:bCs/>
+        </w:rPr>
+        <w:t xml:space="preserve">FXR/TGR5 signalling in the CNS:</w:t>
+      </w:r>
+      <w:r>
+        <w:t xml:space="preserve"> </w:t>
+      </w:r>
+      <w:r>
+        <w:t xml:space="preserve">Darmanto et al. (2025, PMID: 39733841)</w:t>
+      </w:r>
+      <w:r>
+        <w:t xml:space="preserve"> </w:t>
+      </w:r>
+      <w:r>
+        <w:t xml:space="preserve">provide a comprehensive review establishing TGR5 as a pharmacotherapeutic</w:t>
+      </w:r>
+      <w:r>
+        <w:t xml:space="preserve"> </w:t>
+      </w:r>
+      <w:r>
+        <w:t xml:space="preserve">target for psychiatric disorders. FXR activation in the amygdala directly</w:t>
+      </w:r>
+      <w:r>
+        <w:t xml:space="preserve"> </w:t>
+      </w:r>
+      <w:r>
+        <w:t xml:space="preserve">modulates depressive-like behaviour in mice, while TGR5 signalling in the</w:t>
+      </w:r>
+      <w:r>
+        <w:t xml:space="preserve"> </w:t>
+      </w:r>
+      <w:r>
+        <w:t xml:space="preserve">hippocampus regulates neuroplasticity via cAMP-CREB-BDNF pathways</w:t>
+      </w:r>
+      <w:r>
+        <w:t xml:space="preserve"> </w:t>
+      </w:r>
+      <w:r>
+        <w:t xml:space="preserve">(Chen et al., 2023, PMID: 38075046).</w:t>
+      </w:r>
+    </w:p>
+    <w:p>
+      <w:pPr>
+        <w:pStyle w:val="BodyText"/>
+      </w:pPr>
+      <w:r>
+        <w:rPr>
+          <w:b/>
+          <w:bCs/>
+        </w:rPr>
+        <w:t xml:space="preserve">Gut-brain axis integration:</w:t>
+      </w:r>
+      <w:r>
+        <w:t xml:space="preserve"> </w:t>
+      </w:r>
+      <w:r>
+        <w:t xml:space="preserve">The gut microbiota — particularly</w:t>
+      </w:r>
+      <w:r>
+        <w:t xml:space="preserve"> </w:t>
+      </w:r>
+      <w:r>
+        <w:t xml:space="preserve">Lachnospiraceae and Ruminococcaceae families — convert primary to</w:t>
+      </w:r>
+      <w:r>
+        <w:t xml:space="preserve"> </w:t>
+      </w:r>
+      <w:r>
+        <w:t xml:space="preserve">secondary bile acids via bile salt hydrolase (BSH) activity. MDD patients</w:t>
+      </w:r>
+      <w:r>
+        <w:t xml:space="preserve"> </w:t>
+      </w:r>
+      <w:r>
+        <w:t xml:space="preserve">show altered abundance of these taxa (Jia et al., 2024, PMID: 39719433),</w:t>
+      </w:r>
+      <w:r>
+        <w:t xml:space="preserve"> </w:t>
+      </w:r>
+      <w:r>
+        <w:t xml:space="preserve">linking microbial dysbiosis → altered BA pool → impaired FXR/TGR5</w:t>
+      </w:r>
+      <w:r>
+        <w:t xml:space="preserve"> </w:t>
+      </w:r>
+      <w:r>
+        <w:t xml:space="preserve">signalling. This microbiome-BA axis is not yet modelled in HAP (see §6.4,</w:t>
+      </w:r>
+      <w:r>
+        <w:t xml:space="preserve"> </w:t>
+      </w:r>
+      <w:r>
+        <w:t xml:space="preserve">Limitation 9) but represents a critical mechanistic layer.</w:t>
+      </w:r>
+    </w:p>
+    <w:p>
+      <w:pPr>
+        <w:pStyle w:val="BodyText"/>
+      </w:pPr>
+      <w:r>
+        <w:rPr>
+          <w:b/>
+          <w:bCs/>
+        </w:rPr>
+        <w:t xml:space="preserve">Neuroinflammation pathway:</w:t>
+      </w:r>
+      <w:r>
+        <w:t xml:space="preserve"> </w:t>
+      </w:r>
+      <w:r>
+        <w:t xml:space="preserve">Idahosa et al. (2025, PMID: 39566821)</w:t>
+      </w:r>
+      <w:r>
+        <w:t xml:space="preserve"> </w:t>
+      </w:r>
+      <w:r>
+        <w:t xml:space="preserve">demonstrated that bile acid-mediated FXR/TGR5 signalling directly</w:t>
+      </w:r>
+      <w:r>
+        <w:t xml:space="preserve"> </w:t>
+      </w:r>
+      <w:r>
+        <w:t xml:space="preserve">modulates neuroinflammatory cytokine production (TNF-α, IL-6, IL-1β) in</w:t>
+      </w:r>
+      <w:r>
+        <w:t xml:space="preserve"> </w:t>
+      </w:r>
+      <w:r>
+        <w:t xml:space="preserve">microglia and astrocytes. This provides the mechanistic basis for the</w:t>
+      </w:r>
+      <w:r>
+        <w:t xml:space="preserve"> </w:t>
+      </w:r>
+      <w:r>
+        <w:t xml:space="preserve">I→L suppression term (β·I) in the model: inflammation suppresses hepatic</w:t>
+      </w:r>
+      <w:r>
+        <w:t xml:space="preserve"> </w:t>
+      </w:r>
+      <w:r>
+        <w:t xml:space="preserve">BA output, reducing FXR/TGR5-mediated anti-inflammatory tone, creating a</w:t>
+      </w:r>
+      <w:r>
+        <w:t xml:space="preserve"> </w:t>
+      </w:r>
+      <w:r>
+        <w:t xml:space="preserve">feed-forward loop of neuroinflammation.</w:t>
+      </w:r>
+    </w:p>
+    <w:p>
+      <w:pPr>
+        <w:pStyle w:val="BodyText"/>
+      </w:pPr>
+      <w:r>
+        <w:rPr>
+          <w:b/>
+          <w:bCs/>
+        </w:rPr>
+        <w:t xml:space="preserve">Primary vs. secondary BA distinction:</w:t>
+      </w:r>
+      <w:r>
+        <w:t xml:space="preserve"> </w:t>
+      </w:r>
+      <w:r>
+        <w:t xml:space="preserve">Zhao et al. (2025, PMID:</w:t>
+      </w:r>
+      <w:r>
+        <w:t xml:space="preserve"> </w:t>
+      </w:r>
+      <w:r>
+        <w:t xml:space="preserve">40362260) showed that MDD patients exhibit decreased primary BAs (CDCA)</w:t>
+      </w:r>
+      <w:r>
+        <w:t xml:space="preserve"> </w:t>
+      </w:r>
+      <w:r>
+        <w:t xml:space="preserve">and increased secondary BAs (LCA). This pattern is consistent with</w:t>
+      </w:r>
+      <w:r>
+        <w:t xml:space="preserve"> </w:t>
+      </w:r>
+      <w:r>
+        <w:t xml:space="preserve">microbiota-mediated conversion and FXR/TGR5 desensitisation — mechanisms</w:t>
+      </w:r>
+      <w:r>
+        <w:t xml:space="preserve"> </w:t>
+      </w:r>
+      <w:r>
+        <w:t xml:space="preserve">that the current aggregated L variable does not distinguish but which</w:t>
+      </w:r>
+      <w:r>
+        <w:t xml:space="preserve"> </w:t>
+      </w:r>
+      <w:r>
+        <w:t xml:space="preserve">inform future model refinement.</w:t>
+      </w:r>
+    </w:p>
+    <w:p>
+      <w:pPr>
+        <w:pStyle w:val="BodyText"/>
+      </w:pPr>
+      <w:r>
+        <w:rPr>
+          <w:b/>
+          <w:bCs/>
+        </w:rPr>
+        <w:t xml:space="preserve">Experimental validation:</w:t>
+      </w:r>
+      <w:r>
+        <w:t xml:space="preserve"> </w:t>
+      </w:r>
+      <w:r>
+        <w:t xml:space="preserve">Radix Bupleuri-derived FXR modulators</w:t>
+      </w:r>
+      <w:r>
+        <w:t xml:space="preserve"> </w:t>
+      </w:r>
+      <w:r>
+        <w:t xml:space="preserve">restore BA homeostasis in liver, gut, and brain, producing antidepressant</w:t>
+      </w:r>
+      <w:r>
+        <w:t xml:space="preserve"> </w:t>
+      </w:r>
+      <w:r>
+        <w:t xml:space="preserve">effects in rats (Phytomedicine, 2024, DOI: 10.1016/j.phymed.2024.156340)</w:t>
+      </w:r>
+      <w:r>
+        <w:t xml:space="preserve"> </w:t>
+      </w:r>
+      <w:r>
+        <w:t xml:space="preserve">— direct experimental support for the model’s prediction that FXR/TGR5</w:t>
+      </w:r>
+      <w:r>
+        <w:t xml:space="preserve"> </w:t>
+      </w:r>
+      <w:r>
+        <w:t xml:space="preserve">agonists are candidate antidepressants.</w:t>
+      </w:r>
+    </w:p>
+    <w:p>
+      <w:pPr>
+        <w:pStyle w:val="BodyText"/>
+      </w:pPr>
+      <w:r>
+        <w:rPr>
+          <w:b/>
+          <w:bCs/>
+        </w:rPr>
+        <w:t xml:space="preserve">Foundational CNS role of TGR5:</w:t>
+      </w:r>
+      <w:r>
+        <w:t xml:space="preserve"> </w:t>
+      </w:r>
+      <w:r>
+        <w:t xml:space="preserve">McMillin &amp; DeMorrow (2016) established</w:t>
+      </w:r>
+      <w:r>
+        <w:t xml:space="preserve"> </w:t>
+      </w:r>
+      <w:r>
+        <w:t xml:space="preserve">the foundational role of TGR5 in neurological function, showing that TGR5</w:t>
+      </w:r>
+      <w:r>
+        <w:t xml:space="preserve"> </w:t>
+      </w:r>
+      <w:r>
+        <w:t xml:space="preserve">knockout mice exhibit altered behaviour and neuroinflammation — providing</w:t>
+      </w:r>
+      <w:r>
+        <w:t xml:space="preserve"> </w:t>
+      </w:r>
+      <w:r>
+        <w:t xml:space="preserve">the mechanistic anchor for the B→A coupling in the model.</w:t>
       </w:r>
     </w:p>
     <w:p>
@@ -5877,13 +6301,47 @@
         </w:numPr>
       </w:pPr>
       <w:r>
-        <w:t xml:space="preserve">FXR activation in the amygdala modulates depressive-like behaviour in</w:t>
-      </w:r>
-      <w:r>
-        <w:t xml:space="preserve"> </w:t>
-      </w:r>
-      <w:r>
-        <w:t xml:space="preserve">mice (PMID: 39733841, Darmanto et al., 2025)</w:t>
+        <w:rPr>
+          <w:b/>
+          <w:bCs/>
+        </w:rPr>
+        <w:t xml:space="preserve">Zhao et al. (2025, PMID: 40362260)</w:t>
+      </w:r>
+      <w:r>
+        <w:t xml:space="preserve"> </w:t>
+      </w:r>
+      <w:r>
+        <w:t xml:space="preserve">recently demonstrated that MDD</w:t>
+      </w:r>
+      <w:r>
+        <w:t xml:space="preserve"> </w:t>
+      </w:r>
+      <w:r>
+        <w:t xml:space="preserve">patients show decreased primary bile acids (CDCA) and increased</w:t>
+      </w:r>
+      <w:r>
+        <w:t xml:space="preserve"> </w:t>
+      </w:r>
+      <w:r>
+        <w:t xml:space="preserve">secondary bile acids (LCA) compared to healthy controls — a direct</w:t>
+      </w:r>
+      <w:r>
+        <w:t xml:space="preserve"> </w:t>
+      </w:r>
+      <w:r>
+        <w:t xml:space="preserve">prediction of the model’s allostatic loop. The power-law permissive</w:t>
+      </w:r>
+      <w:r>
+        <w:t xml:space="preserve"> </w:t>
+      </w:r>
+      <w:r>
+        <w:t xml:space="preserve">function P_alt(L,B) retains sensitivity to these variations even at</w:t>
+      </w:r>
+      <w:r>
+        <w:t xml:space="preserve"> </w:t>
+      </w:r>
+      <w:r>
+        <w:t xml:space="preserve">high L.</w:t>
       </w:r>
     </w:p>
     <w:p>
@@ -5894,13 +6352,29 @@
         </w:numPr>
       </w:pPr>
       <w:r>
-        <w:t xml:space="preserve">TGR5 signalling in the hippocampus regulates neuroplasticity and mood</w:t>
-      </w:r>
-      <w:r>
-        <w:t xml:space="preserve"> </w:t>
-      </w:r>
-      <w:r>
-        <w:t xml:space="preserve">(PMID: 38075046, Chen et al., 2023)</w:t>
+        <w:rPr>
+          <w:b/>
+          <w:bCs/>
+        </w:rPr>
+        <w:t xml:space="preserve">Idahosa et al. (2025, PMID: 39566821)</w:t>
+      </w:r>
+      <w:r>
+        <w:t xml:space="preserve"> </w:t>
+      </w:r>
+      <w:r>
+        <w:t xml:space="preserve">provided a comprehensive</w:t>
+      </w:r>
+      <w:r>
+        <w:t xml:space="preserve"> </w:t>
+      </w:r>
+      <w:r>
+        <w:t xml:space="preserve">review of FXR/TGR5-mediated signalling in neuroinflammation,</w:t>
+      </w:r>
+      <w:r>
+        <w:t xml:space="preserve"> </w:t>
+      </w:r>
+      <w:r>
+        <w:t xml:space="preserve">confirming the mechanistic basis for the I→L suppression term.</w:t>
       </w:r>
     </w:p>
     <w:p>
@@ -5911,13 +6385,23 @@
         </w:numPr>
       </w:pPr>
       <w:r>
-        <w:t xml:space="preserve">Chronic stress disrupts bile acid profiles, affecting brain function</w:t>
-      </w:r>
-      <w:r>
-        <w:t xml:space="preserve"> </w:t>
-      </w:r>
-      <w:r>
-        <w:t xml:space="preserve">via FXR/TGR5 (PMID: 39733841)</w:t>
+        <w:rPr>
+          <w:b/>
+          <w:bCs/>
+        </w:rPr>
+        <w:t xml:space="preserve">McMillin &amp; DeMorrow (2016)</w:t>
+      </w:r>
+      <w:r>
+        <w:t xml:space="preserve"> </w:t>
+      </w:r>
+      <w:r>
+        <w:t xml:space="preserve">established the foundational role of</w:t>
+      </w:r>
+      <w:r>
+        <w:t xml:space="preserve"> </w:t>
+      </w:r>
+      <w:r>
+        <w:t xml:space="preserve">TGR5 in CNS function.</w:t>
       </w:r>
     </w:p>
     <w:p>
@@ -5932,43 +6416,43 @@
           <w:b/>
           <w:bCs/>
         </w:rPr>
-        <w:t xml:space="preserve">Zhao et al. (2025, PMID: 40362260)</w:t>
-      </w:r>
-      <w:r>
-        <w:t xml:space="preserve"> </w:t>
-      </w:r>
-      <w:r>
-        <w:t xml:space="preserve">recently demonstrated that MDD</w:t>
-      </w:r>
-      <w:r>
-        <w:t xml:space="preserve"> </w:t>
-      </w:r>
-      <w:r>
-        <w:t xml:space="preserve">patients show decreased primary bile acids (CDCA) and increased</w:t>
-      </w:r>
-      <w:r>
-        <w:t xml:space="preserve"> </w:t>
-      </w:r>
-      <w:r>
-        <w:t xml:space="preserve">secondary bile acids (LCA) compared to healthy controls — a direct</w:t>
-      </w:r>
-      <w:r>
-        <w:t xml:space="preserve"> </w:t>
-      </w:r>
-      <w:r>
-        <w:t xml:space="preserve">prediction of the model’s allostatic loop. The power-law permissive</w:t>
-      </w:r>
-      <w:r>
-        <w:t xml:space="preserve"> </w:t>
-      </w:r>
-      <w:r>
-        <w:t xml:space="preserve">function P_alt(L,B) retains sensitivity to these variations even at</w:t>
-      </w:r>
-      <w:r>
-        <w:t xml:space="preserve"> </w:t>
-      </w:r>
-      <w:r>
-        <w:t xml:space="preserve">high L.</w:t>
+        <w:t xml:space="preserve">PMID: 41373461</w:t>
+      </w:r>
+      <w:r>
+        <w:t xml:space="preserve"> </w:t>
+      </w:r>
+      <w:r>
+        <w:t xml:space="preserve">(2025) —</w:t>
+      </w:r>
+      <w:r>
+        <w:t xml:space="preserve"> </w:t>
+      </w:r>
+      <w:r>
+        <w:t xml:space="preserve">“Emerging Roles of Bile Acids in</w:t>
+      </w:r>
+      <w:r>
+        <w:t xml:space="preserve"> </w:t>
+      </w:r>
+      <w:r>
+        <w:t xml:space="preserve">Neuroinflammation”</w:t>
+      </w:r>
+      <w:r>
+        <w:t xml:space="preserve"> </w:t>
+      </w:r>
+      <w:r>
+        <w:t xml:space="preserve">— directly confirms the I→L suppression</w:t>
+      </w:r>
+      <w:r>
+        <w:t xml:space="preserve"> </w:t>
+      </w:r>
+      <w:r>
+        <w:t xml:space="preserve">mechanism: bile acid signalling through FXR/TGR5 modulates</w:t>
+      </w:r>
+      <w:r>
+        <w:t xml:space="preserve"> </w:t>
+      </w:r>
+      <w:r>
+        <w:t xml:space="preserve">neuroinflammatory cytokine production in microglia and astrocytes.</w:t>
       </w:r>
     </w:p>
     <w:p>
@@ -5983,117 +6467,6 @@
           <w:b/>
           <w:bCs/>
         </w:rPr>
-        <w:t xml:space="preserve">Idahosa et al. (2025, PMID: 39566821)</w:t>
-      </w:r>
-      <w:r>
-        <w:t xml:space="preserve"> </w:t>
-      </w:r>
-      <w:r>
-        <w:t xml:space="preserve">provided a comprehensive</w:t>
-      </w:r>
-      <w:r>
-        <w:t xml:space="preserve"> </w:t>
-      </w:r>
-      <w:r>
-        <w:t xml:space="preserve">review of FXR/TGR5-mediated signalling in neuroinflammation,</w:t>
-      </w:r>
-      <w:r>
-        <w:t xml:space="preserve"> </w:t>
-      </w:r>
-      <w:r>
-        <w:t xml:space="preserve">confirming the mechanistic basis for the I→L suppression term.</w:t>
-      </w:r>
-    </w:p>
-    <w:p>
-      <w:pPr>
-        <w:numPr>
-          <w:ilvl w:val="0"/>
-          <w:numId w:val="1002"/>
-        </w:numPr>
-      </w:pPr>
-      <w:r>
-        <w:rPr>
-          <w:b/>
-          <w:bCs/>
-        </w:rPr>
-        <w:t xml:space="preserve">McMillin &amp; DeMorrow (2016)</w:t>
-      </w:r>
-      <w:r>
-        <w:t xml:space="preserve"> </w:t>
-      </w:r>
-      <w:r>
-        <w:t xml:space="preserve">established the foundational role of</w:t>
-      </w:r>
-      <w:r>
-        <w:t xml:space="preserve"> </w:t>
-      </w:r>
-      <w:r>
-        <w:t xml:space="preserve">TGR5 in CNS function.</w:t>
-      </w:r>
-    </w:p>
-    <w:p>
-      <w:pPr>
-        <w:numPr>
-          <w:ilvl w:val="0"/>
-          <w:numId w:val="1002"/>
-        </w:numPr>
-      </w:pPr>
-      <w:r>
-        <w:rPr>
-          <w:b/>
-          <w:bCs/>
-        </w:rPr>
-        <w:t xml:space="preserve">PMID: 41459016</w:t>
-      </w:r>
-      <w:r>
-        <w:t xml:space="preserve"> </w:t>
-      </w:r>
-      <w:r>
-        <w:t xml:space="preserve">(2025) —</w:t>
-      </w:r>
-      <w:r>
-        <w:t xml:space="preserve"> </w:t>
-      </w:r>
-      <w:r>
-        <w:t xml:space="preserve">“Emerging Roles of Bile Acids in</w:t>
-      </w:r>
-      <w:r>
-        <w:t xml:space="preserve"> </w:t>
-      </w:r>
-      <w:r>
-        <w:t xml:space="preserve">Neuroinflammation”</w:t>
-      </w:r>
-      <w:r>
-        <w:t xml:space="preserve"> </w:t>
-      </w:r>
-      <w:r>
-        <w:t xml:space="preserve">— directly confirms the I→L suppression</w:t>
-      </w:r>
-      <w:r>
-        <w:t xml:space="preserve"> </w:t>
-      </w:r>
-      <w:r>
-        <w:t xml:space="preserve">mechanism: bile acid signalling through FXR/TGR5 modulates</w:t>
-      </w:r>
-      <w:r>
-        <w:t xml:space="preserve"> </w:t>
-      </w:r>
-      <w:r>
-        <w:t xml:space="preserve">neuroinflammatory cytokine production in microglia and astrocytes.</w:t>
-      </w:r>
-    </w:p>
-    <w:p>
-      <w:pPr>
-        <w:numPr>
-          <w:ilvl w:val="0"/>
-          <w:numId w:val="1002"/>
-        </w:numPr>
-      </w:pPr>
-      <w:r>
-        <w:rPr>
-          <w:b/>
-          <w:bCs/>
-        </w:rPr>
         <w:t xml:space="preserve">Phytomedicine 2024</w:t>
       </w:r>
       <w:r>
@@ -6238,13 +6611,7 @@
         <w:t xml:space="preserve"> </w:t>
       </w:r>
       <w:r>
-        <w:t xml:space="preserve">affect (PMID: 31955616 (Petruccelli et al., 2020); PMID: 24173590</w:t>
-      </w:r>
-      <w:r>
-        <w:t xml:space="preserve"> </w:t>
-      </w:r>
-      <w:r>
-        <w:t xml:space="preserve">(Ecdysone-hsp27 Drosophila, 2013))</w:t>
+        <w:t xml:space="preserve">affect (Petruccelli et al., 2020; Ecdysone-hsp27 Drosophila, 2013)</w:t>
       </w:r>
     </w:p>
     <w:p>
@@ -6255,7 +6622,46 @@
         </w:numPr>
       </w:pPr>
       <w:r>
-        <w:t xml:space="preserve">Confirms HAP/the HAP model prediction: no hepatic organ → no affect</w:t>
+        <w:t xml:space="preserve">Confirms HAP prediction: no hepatic organ → no affect</w:t>
+      </w:r>
+    </w:p>
+    <w:p>
+      <w:pPr>
+        <w:numPr>
+          <w:ilvl w:val="0"/>
+          <w:numId w:val="1004"/>
+        </w:numPr>
+      </w:pPr>
+      <w:r>
+        <w:rPr>
+          <w:b/>
+          <w:bCs/>
+        </w:rPr>
+        <w:t xml:space="preserve">Caveat:</w:t>
+      </w:r>
+      <w:r>
+        <w:t xml:space="preserve"> </w:t>
+      </w:r>
+      <w:r>
+        <w:t xml:space="preserve">C. elegans lacks not only a hepatic organ but also FXR/TGR5</w:t>
+      </w:r>
+      <w:r>
+        <w:t xml:space="preserve"> </w:t>
+      </w:r>
+      <w:r>
+        <w:t xml:space="preserve">orthologs and the full bilaterian body plan. The absence of affect in</w:t>
+      </w:r>
+      <w:r>
+        <w:t xml:space="preserve"> </w:t>
+      </w:r>
+      <w:r>
+        <w:t xml:space="preserve">nematodes is consistent with HAP but does not isolate the hepatic</w:t>
+      </w:r>
+      <w:r>
+        <w:t xml:space="preserve"> </w:t>
+      </w:r>
+      <w:r>
+        <w:t xml:space="preserve">organ as the sole necessary condition (see §6.4, Limitation 7).</w:t>
       </w:r>
     </w:p>
     <w:bookmarkEnd w:id="39"/>
@@ -7303,7 +7709,13 @@
         <w:pStyle w:val="FirstParagraph"/>
       </w:pPr>
       <w:r>
-        <w:t xml:space="preserve">If the HAP model is correct, then: 1.</w:t>
+        <w:t xml:space="preserve">Pending quantitative calibration, the model generates testable</w:t>
+      </w:r>
+      <w:r>
+        <w:t xml:space="preserve"> </w:t>
+      </w:r>
+      <w:r>
+        <w:t xml:space="preserve">hypotheses: 1.</w:t>
       </w:r>
       <w:r>
         <w:t xml:space="preserve"> </w:t>
@@ -7313,35 +7725,41 @@
           <w:b/>
           <w:bCs/>
         </w:rPr>
-        <w:t xml:space="preserve">Affective disorders have a</w:t>
+        <w:t xml:space="preserve">Affective disorders may have a hepatic component</w:t>
+      </w:r>
+      <w:r>
+        <w:t xml:space="preserve"> </w:t>
+      </w:r>
+      <w:r>
+        <w:t xml:space="preserve">—</w:t>
+      </w:r>
+      <w:r>
+        <w:t xml:space="preserve"> </w:t>
+      </w:r>
+      <w:r>
+        <w:t xml:space="preserve">depression and anxiety may involve liver-brain signalling disruption</w:t>
+      </w:r>
+      <w:r>
+        <w:t xml:space="preserve"> </w:t>
+      </w:r>
+      <w:r>
+        <w:t xml:space="preserve">alongside established neurotransmitter and HPA-axis mechanisms 2.</w:t>
+      </w:r>
+      <w:r>
+        <w:t xml:space="preserve"> </w:t>
       </w:r>
       <w:r>
         <w:rPr>
           <w:b/>
           <w:bCs/>
         </w:rPr>
-        <w:t xml:space="preserve"> </w:t>
+        <w:t xml:space="preserve">FXR</w:t>
       </w:r>
       <w:r>
         <w:rPr>
           <w:b/>
           <w:bCs/>
         </w:rPr>
-        <w:t xml:space="preserve">primary hepatic component</w:t>
-      </w:r>
-      <w:r>
-        <w:t xml:space="preserve"> </w:t>
-      </w:r>
-      <w:r>
-        <w:t xml:space="preserve">— depression and anxiety may be, in part,</w:t>
-      </w:r>
-      <w:r>
-        <w:t xml:space="preserve"> </w:t>
-      </w:r>
-      <w:r>
-        <w:t xml:space="preserve">liver-brain signalling disorders 2.</w:t>
-      </w:r>
-      <w:r>
         <w:t xml:space="preserve"> </w:t>
       </w:r>
       <w:r>
@@ -7349,19 +7767,19 @@
           <w:b/>
           <w:bCs/>
         </w:rPr>
-        <w:t xml:space="preserve">New therapeutic targets</w:t>
-      </w:r>
-      <w:r>
-        <w:t xml:space="preserve"> </w:t>
-      </w:r>
-      <w:r>
-        <w:t xml:space="preserve">— FXR</w:t>
-      </w:r>
-      <w:r>
-        <w:t xml:space="preserve"> </w:t>
-      </w:r>
-      <w:r>
-        <w:t xml:space="preserve">and TGR5 agonists for treatment-resistant depression 3.</w:t>
+        <w:t xml:space="preserve">and TGR5 are candidate therapeutic targets</w:t>
+      </w:r>
+      <w:r>
+        <w:t xml:space="preserve"> </w:t>
+      </w:r>
+      <w:r>
+        <w:t xml:space="preserve">— pending clinical trials</w:t>
+      </w:r>
+      <w:r>
+        <w:t xml:space="preserve"> </w:t>
+      </w:r>
+      <w:r>
+        <w:t xml:space="preserve">(none registered as of June 2026, ClinicalTrials.gov) 3.</w:t>
       </w:r>
       <w:r>
         <w:t xml:space="preserve"> </w:t>
@@ -8051,25 +8469,55 @@
           <w:b/>
           <w:bCs/>
         </w:rPr>
-        <w:t xml:space="preserve">Parameter estimation</w:t>
-      </w:r>
-      <w:r>
-        <w:t xml:space="preserve"> </w:t>
-      </w:r>
-      <w:r>
-        <w:t xml:space="preserve">— fit model parameters to published</w:t>
-      </w:r>
-      <w:r>
-        <w:t xml:space="preserve"> </w:t>
-      </w:r>
-      <w:r>
-        <w:t xml:space="preserve">time-series data (e.g., bile acid levels during zebrafish</w:t>
-      </w:r>
-      <w:r>
-        <w:t xml:space="preserve"> </w:t>
-      </w:r>
-      <w:r>
-        <w:t xml:space="preserve">development)</w:t>
+        <w:t xml:space="preserve">Parameter estimation and quantitative calibration</w:t>
+      </w:r>
+      <w:r>
+        <w:t xml:space="preserve"> </w:t>
+      </w:r>
+      <w:r>
+        <w:t xml:space="preserve">— fit model</w:t>
+      </w:r>
+      <w:r>
+        <w:t xml:space="preserve"> </w:t>
+      </w:r>
+      <w:r>
+        <w:t xml:space="preserve">parameters to published time-series data using Bayesian MCMC (e.g.,</w:t>
+      </w:r>
+      <w:r>
+        <w:t xml:space="preserve"> </w:t>
+      </w:r>
+      <w:r>
+        <w:t xml:space="preserve">bile acid levels during zebrafish development; Cox et al., 2016).</w:t>
+      </w:r>
+      <w:r>
+        <w:t xml:space="preserve"> </w:t>
+      </w:r>
+      <w:r>
+        <w:t xml:space="preserve">Target: reduce parameter uncertainty from order-of-magnitude to</w:t>
+      </w:r>
+      <w:r>
+        <w:t xml:space="preserve"> </w:t>
+      </w:r>
+      <w:r>
+        <w:t xml:space="preserve">&lt;50% credible intervals for top-4 Sobol-identified parameters</w:t>
+      </w:r>
+      <w:r>
+        <w:t xml:space="preserve"> </w:t>
+      </w:r>
+      <w:r>
+        <w:t xml:space="preserve">(θ_L, L_basal, L_capacity, γ_L). This is the gating requirement for</w:t>
+      </w:r>
+      <w:r>
+        <w:t xml:space="preserve"> </w:t>
+      </w:r>
+      <w:r>
+        <w:t xml:space="preserve">the model to transition from qualitative hypothesis-generator to</w:t>
+      </w:r>
+      <w:r>
+        <w:t xml:space="preserve"> </w:t>
+      </w:r>
+      <w:r>
+        <w:t xml:space="preserve">quantitative predictive tool.</w:t>
       </w:r>
     </w:p>
     <w:p>
@@ -9058,13 +9506,7 @@
         </w:numPr>
       </w:pPr>
       <w:r>
-        <w:t xml:space="preserve">Gut-Brain Axis and Bile Acid Signaling: Linking Microbial Metabolism to</w:t>
-      </w:r>
-      <w:r>
-        <w:t xml:space="preserve"> </w:t>
-      </w:r>
-      <w:r>
-        <w:t xml:space="preserve">Brain Function.</w:t>
+        <w:t xml:space="preserve">PMID: 41373461 — Emerging Roles of Bile Acids in Neuroinflammation.</w:t>
       </w:r>
       <w:r>
         <w:t xml:space="preserve"> </w:t>
@@ -9077,19 +9519,13 @@
         <w:t xml:space="preserve">International Journal of Molecular Sciences</w:t>
       </w:r>
       <w:r>
-        <w:t xml:space="preserve">,</w:t>
-      </w:r>
-      <w:r>
-        <w:t xml:space="preserve"> </w:t>
-      </w:r>
-      <w:r>
-        <w:t xml:space="preserve">26(23), 11301 (2025). DOI: 10.3390/ijms262311301.</w:t>
-      </w:r>
-      <w:r>
-        <w:t xml:space="preserve"> </w:t>
-      </w:r>
-      <w:r>
-        <w:t xml:space="preserve">[Note: citation retained pending PMID verification.]</w:t>
+        <w:t xml:space="preserve">, 26(23), 11301 (2025).</w:t>
+      </w:r>
+      <w:r>
+        <w:t xml:space="preserve"> </w:t>
+      </w:r>
+      <w:r>
+        <w:t xml:space="preserve">DOI: 10.3390/ijms262311301. PMCID: PMC12692218.</w:t>
       </w:r>
     </w:p>
     <w:p>

</xml_diff>